<commit_message>
[FIX] Validacion RED v1.0
</commit_message>
<xml_diff>
--- a/fuentes/CF3_41730034_DI.docx
+++ b/fuentes/CF3_41730034_DI.docx
@@ -1,6 +1,6 @@
 
 <file path=word/document.xml><?xml version="1.0" encoding="utf-8"?>
-<w:document xmlns:wpc="http://schemas.microsoft.com/office/word/2010/wordprocessingCanvas" xmlns:mc="http://schemas.openxmlformats.org/markup-compatibility/2006" xmlns:o="urn:schemas-microsoft-com:office:office" xmlns:r="http://schemas.openxmlformats.org/officeDocument/2006/relationships" xmlns:m="http://schemas.openxmlformats.org/officeDocument/2006/math" xmlns:v="urn:schemas-microsoft-com:vml" xmlns:wp14="http://schemas.microsoft.com/office/word/2010/wordprocessingDrawing" xmlns:wp="http://schemas.openxmlformats.org/drawingml/2006/wordprocessingDrawing" xmlns:w10="urn:schemas-microsoft-com:office:word" xmlns:w="http://schemas.openxmlformats.org/wordprocessingml/2006/main" xmlns:w14="http://schemas.microsoft.com/office/word/2010/wordml" xmlns:w15="http://schemas.microsoft.com/office/word/2012/wordml" xmlns:wpg="http://schemas.microsoft.com/office/word/2010/wordprocessingGroup" xmlns:wpi="http://schemas.microsoft.com/office/word/2010/wordprocessingInk" xmlns:wne="http://schemas.microsoft.com/office/word/2006/wordml" xmlns:wps="http://schemas.microsoft.com/office/word/2010/wordprocessingShape" mc:Ignorable="w14 w15 wp14">
+<w:document xmlns:wpc="http://schemas.microsoft.com/office/word/2010/wordprocessingCanvas" xmlns:cx="http://schemas.microsoft.com/office/drawing/2014/chartex" xmlns:cx1="http://schemas.microsoft.com/office/drawing/2015/9/8/chartex" xmlns:cx2="http://schemas.microsoft.com/office/drawing/2015/10/21/chartex" xmlns:cx3="http://schemas.microsoft.com/office/drawing/2016/5/9/chartex" xmlns:cx4="http://schemas.microsoft.com/office/drawing/2016/5/10/chartex" xmlns:cx5="http://schemas.microsoft.com/office/drawing/2016/5/11/chartex" xmlns:cx6="http://schemas.microsoft.com/office/drawing/2016/5/12/chartex" xmlns:cx7="http://schemas.microsoft.com/office/drawing/2016/5/13/chartex" xmlns:cx8="http://schemas.microsoft.com/office/drawing/2016/5/14/chartex" xmlns:mc="http://schemas.openxmlformats.org/markup-compatibility/2006" xmlns:aink="http://schemas.microsoft.com/office/drawing/2016/ink" xmlns:am3d="http://schemas.microsoft.com/office/drawing/2017/model3d" xmlns:o="urn:schemas-microsoft-com:office:office" xmlns:oel="http://schemas.microsoft.com/office/2019/extlst" xmlns:r="http://schemas.openxmlformats.org/officeDocument/2006/relationships" xmlns:m="http://schemas.openxmlformats.org/officeDocument/2006/math" xmlns:v="urn:schemas-microsoft-com:vml" xmlns:wp14="http://schemas.microsoft.com/office/word/2010/wordprocessingDrawing" xmlns:wp="http://schemas.openxmlformats.org/drawingml/2006/wordprocessingDrawing" xmlns:w10="urn:schemas-microsoft-com:office:word" xmlns:w="http://schemas.openxmlformats.org/wordprocessingml/2006/main" xmlns:w14="http://schemas.microsoft.com/office/word/2010/wordml" xmlns:w15="http://schemas.microsoft.com/office/word/2012/wordml" xmlns:w16cex="http://schemas.microsoft.com/office/word/2018/wordml/cex" xmlns:w16cid="http://schemas.microsoft.com/office/word/2016/wordml/cid" xmlns:w16="http://schemas.microsoft.com/office/word/2018/wordml" xmlns:w16du="http://schemas.microsoft.com/office/word/2023/wordml/word16du" xmlns:w16sdtdh="http://schemas.microsoft.com/office/word/2020/wordml/sdtdatahash" xmlns:w16sdtfl="http://schemas.microsoft.com/office/word/2024/wordml/sdtformatlock" xmlns:w16se="http://schemas.microsoft.com/office/word/2015/wordml/symex" xmlns:wpg="http://schemas.microsoft.com/office/word/2010/wordprocessingGroup" xmlns:wpi="http://schemas.microsoft.com/office/word/2010/wordprocessingInk" xmlns:wne="http://schemas.microsoft.com/office/word/2006/wordml" xmlns:wps="http://schemas.microsoft.com/office/word/2010/wordprocessingShape" mc:Ignorable="w14 w15 w16se w16cid w16 w16cex w16sdtdh w16sdtfl w16du wp14">
   <w:body>
     <w:p>
       <w:pPr>
@@ -903,7 +903,19 @@
         <w:rPr>
           <w:b/>
         </w:rPr>
-        <w:t xml:space="preserve">1.2. </w:t>
+        <w:t>1.</w:t>
+      </w:r>
+      <w:r>
+        <w:rPr>
+          <w:b/>
+        </w:rPr>
+        <w:t>1</w:t>
+      </w:r>
+      <w:r>
+        <w:rPr>
+          <w:b/>
+        </w:rPr>
+        <w:t xml:space="preserve">. </w:t>
       </w:r>
       <w:r>
         <w:t>Los derechos humanos y su aporte al desarrollo humano</w:t>
@@ -923,7 +935,21 @@
           <w:bCs/>
         </w:rPr>
         <w:lastRenderedPageBreak/>
-        <w:t xml:space="preserve">1.3.  </w:t>
+        <w:t>1.</w:t>
+      </w:r>
+      <w:r>
+        <w:rPr>
+          <w:b/>
+          <w:bCs/>
+        </w:rPr>
+        <w:t>2</w:t>
+      </w:r>
+      <w:r>
+        <w:rPr>
+          <w:b/>
+          <w:bCs/>
+        </w:rPr>
+        <w:t xml:space="preserve">.  </w:t>
       </w:r>
       <w:r>
         <w:rPr>
@@ -1137,8 +1163,6 @@
         </w:rPr>
         <w:t xml:space="preserve"> de la Estrategia de Entornos S</w:t>
       </w:r>
-      <w:bookmarkStart w:id="0" w:name="_GoBack"/>
-      <w:bookmarkEnd w:id="0"/>
       <w:r>
         <w:rPr>
           <w:bCs/>
@@ -1320,19 +1344,19 @@
         </w:rPr>
         <w:t xml:space="preserve">La promoción de la salud es un proceso fundamental que busca fortalecer las capacidades de </w:t>
       </w:r>
-      <w:commentRangeStart w:id="1"/>
+      <w:commentRangeStart w:id="0"/>
       <w:r>
         <w:rPr>
           <w:bCs/>
         </w:rPr>
         <w:t>las</w:t>
       </w:r>
-      <w:commentRangeEnd w:id="1"/>
+      <w:commentRangeEnd w:id="0"/>
       <w:r>
         <w:rPr>
           <w:rStyle w:val="Refdecomentario"/>
         </w:rPr>
-        <w:commentReference w:id="1"/>
+        <w:commentReference w:id="0"/>
       </w:r>
       <w:r>
         <w:rPr>
@@ -1590,7 +1614,7 @@
         <w:t>Así, se establece un equilibrio entre las capacidades y las oportunidades, avanzando hacia un desarrollo humano sostenible, definido como "la ampliación de las oportunidades y capacidades de las personas a través de la formación de capital social, para suplir de forma equitativa las necesidades presentes sin comprometer las de las generaciones futuras".</w:t>
       </w:r>
     </w:p>
-    <w:commentRangeStart w:id="2"/>
+    <w:commentRangeStart w:id="1"/>
     <w:p>
       <w:pPr>
         <w:spacing w:line="360" w:lineRule="auto"/>
@@ -1673,12 +1697,12 @@
           </mc:Fallback>
         </mc:AlternateContent>
       </w:r>
-      <w:commentRangeEnd w:id="2"/>
+      <w:commentRangeEnd w:id="1"/>
       <w:r>
         <w:rPr>
           <w:rStyle w:val="Refdecomentario"/>
         </w:rPr>
-        <w:commentReference w:id="2"/>
+        <w:commentReference w:id="1"/>
       </w:r>
     </w:p>
     <w:p>
@@ -2716,7 +2740,7 @@
         <w:t>olítica de 1991 reconoce los derechos humanos como pilar fundamental, destacando en el Artículo 5:</w:t>
       </w:r>
     </w:p>
-    <w:commentRangeStart w:id="3"/>
+    <w:commentRangeStart w:id="2"/>
     <w:p>
       <w:pPr>
         <w:spacing w:line="360" w:lineRule="auto"/>
@@ -2798,12 +2822,12 @@
           </mc:Fallback>
         </mc:AlternateContent>
       </w:r>
-      <w:commentRangeEnd w:id="3"/>
+      <w:commentRangeEnd w:id="2"/>
       <w:r>
         <w:rPr>
           <w:rStyle w:val="Refdecomentario"/>
         </w:rPr>
-        <w:commentReference w:id="3"/>
+        <w:commentReference w:id="2"/>
       </w:r>
     </w:p>
     <w:p>
@@ -3109,19 +3133,19 @@
         </w:rPr>
         <w:t xml:space="preserve">"El conjunto de factores personales, sociales, económicos y ambientales que determinan el </w:t>
       </w:r>
-      <w:commentRangeStart w:id="4"/>
+      <w:commentRangeStart w:id="3"/>
       <w:r>
         <w:rPr>
           <w:bCs/>
         </w:rPr>
         <w:t>estado</w:t>
       </w:r>
-      <w:commentRangeEnd w:id="4"/>
+      <w:commentRangeEnd w:id="3"/>
       <w:r>
         <w:rPr>
           <w:rStyle w:val="Refdecomentario"/>
         </w:rPr>
-        <w:commentReference w:id="4"/>
+        <w:commentReference w:id="3"/>
       </w:r>
       <w:r>
         <w:rPr>
@@ -4875,7 +4899,7 @@
         <w:t xml:space="preserve"> como:</w:t>
       </w:r>
     </w:p>
-    <w:commentRangeStart w:id="5"/>
+    <w:commentRangeStart w:id="4"/>
     <w:p>
       <w:pPr>
         <w:spacing w:line="360" w:lineRule="auto"/>
@@ -4957,12 +4981,12 @@
           </mc:Fallback>
         </mc:AlternateContent>
       </w:r>
-      <w:commentRangeEnd w:id="5"/>
+      <w:commentRangeEnd w:id="4"/>
       <w:r>
         <w:rPr>
           <w:rStyle w:val="Refdecomentario"/>
         </w:rPr>
-        <w:commentReference w:id="5"/>
+        <w:commentReference w:id="4"/>
       </w:r>
     </w:p>
     <w:p>
@@ -8069,19 +8093,19 @@
               </w:rPr>
               <w:t xml:space="preserve">alud (SGSSS), garantizando el acceso de la población </w:t>
             </w:r>
-            <w:commentRangeStart w:id="6"/>
+            <w:commentRangeStart w:id="5"/>
             <w:r>
               <w:rPr>
                 <w:bCs/>
               </w:rPr>
               <w:t>colombiana</w:t>
             </w:r>
-            <w:commentRangeEnd w:id="6"/>
+            <w:commentRangeEnd w:id="5"/>
             <w:r>
               <w:rPr>
                 <w:rStyle w:val="Refdecomentario"/>
               </w:rPr>
-              <w:commentReference w:id="6"/>
+              <w:commentReference w:id="5"/>
             </w:r>
             <w:r>
               <w:rPr>
@@ -9429,7 +9453,7 @@
           <w:bCs/>
         </w:rPr>
       </w:pPr>
-      <w:commentRangeStart w:id="7"/>
+      <w:commentRangeStart w:id="6"/>
       <w:r>
         <w:rPr>
           <w:bCs/>
@@ -9453,7 +9477,7 @@
                     <pic:cNvPicPr/>
                   </pic:nvPicPr>
                   <pic:blipFill>
-                    <a:blip r:embed="rId13">
+                    <a:blip r:embed="rId14">
                       <a:extLst>
                         <a:ext uri="{28A0092B-C50C-407E-A947-70E740481C1C}">
                           <a14:useLocalDpi xmlns:a14="http://schemas.microsoft.com/office/drawing/2010/main" val="0"/>
@@ -9479,12 +9503,12 @@
           </wp:inline>
         </w:drawing>
       </w:r>
-      <w:commentRangeEnd w:id="7"/>
+      <w:commentRangeEnd w:id="6"/>
       <w:r>
         <w:rPr>
           <w:rStyle w:val="Refdecomentario"/>
         </w:rPr>
-        <w:commentReference w:id="7"/>
+        <w:commentReference w:id="6"/>
       </w:r>
     </w:p>
     <w:p>
@@ -9889,19 +9913,19 @@
               </w:rPr>
               <w:t>Creencias en salud (</w:t>
             </w:r>
-            <w:commentRangeStart w:id="8"/>
+            <w:commentRangeStart w:id="7"/>
             <w:r>
               <w:rPr>
                 <w:bCs/>
               </w:rPr>
               <w:t>cogniciones</w:t>
             </w:r>
-            <w:commentRangeEnd w:id="8"/>
+            <w:commentRangeEnd w:id="7"/>
             <w:r>
               <w:rPr>
                 <w:rStyle w:val="Refdecomentario"/>
               </w:rPr>
-              <w:commentReference w:id="8"/>
+              <w:commentReference w:id="7"/>
             </w:r>
             <w:r>
               <w:rPr>
@@ -10544,19 +10568,19 @@
         </w:rPr>
         <w:t xml:space="preserve">siguiente </w:t>
       </w:r>
-      <w:commentRangeStart w:id="9"/>
+      <w:commentRangeStart w:id="8"/>
       <w:r>
         <w:rPr>
           <w:bCs/>
         </w:rPr>
         <w:t>video</w:t>
       </w:r>
-      <w:commentRangeEnd w:id="9"/>
+      <w:commentRangeEnd w:id="8"/>
       <w:r>
         <w:rPr>
           <w:rStyle w:val="Refdecomentario"/>
         </w:rPr>
-        <w:commentReference w:id="9"/>
+        <w:commentReference w:id="8"/>
       </w:r>
       <w:r>
         <w:rPr>
@@ -10567,7 +10591,7 @@
       <w:r>
         <w:t xml:space="preserve"> </w:t>
       </w:r>
-      <w:hyperlink r:id="rId14" w:history="1">
+      <w:hyperlink r:id="rId15" w:history="1">
         <w:r>
           <w:rPr>
             <w:rStyle w:val="Hipervnculo"/>
@@ -10798,21 +10822,7 @@
         <w:rPr>
           <w:bCs/>
         </w:rPr>
-        <w:t xml:space="preserve">Coordinación entre niveles de atención para la referencia y </w:t>
-      </w:r>
-      <w:proofErr w:type="spellStart"/>
-      <w:r>
-        <w:rPr>
-          <w:bCs/>
-        </w:rPr>
-        <w:t>contrarreferencia</w:t>
-      </w:r>
-      <w:proofErr w:type="spellEnd"/>
-      <w:r>
-        <w:rPr>
-          <w:bCs/>
-        </w:rPr>
-        <w:t xml:space="preserve"> de pacientes.</w:t>
+        <w:t>Coordinación entre niveles de atención para la referencia y contrarreferencia de pacientes.</w:t>
       </w:r>
     </w:p>
     <w:p>
@@ -10917,14 +10927,12 @@
         </w:rPr>
         <w:t xml:space="preserve">Formación y actualización </w:t>
       </w:r>
-      <w:proofErr w:type="spellStart"/>
       <w:r>
         <w:rPr>
           <w:bCs/>
         </w:rPr>
         <w:t>continúa</w:t>
       </w:r>
-      <w:proofErr w:type="spellEnd"/>
       <w:r>
         <w:rPr>
           <w:bCs/>
@@ -12856,7 +12864,7 @@
       <w:r>
         <w:t xml:space="preserve"> </w:t>
       </w:r>
-      <w:commentRangeStart w:id="10"/>
+      <w:commentRangeStart w:id="9"/>
       <w:r>
         <w:rPr>
           <w:bCs/>
@@ -12885,6 +12893,11 @@
         <w:rPr>
           <w:bCs/>
         </w:rPr>
+      </w:r>
+      <w:r>
+        <w:rPr>
+          <w:bCs/>
+        </w:rPr>
         <w:fldChar w:fldCharType="separate"/>
       </w:r>
       <w:r>
@@ -12900,12 +12913,12 @@
         </w:rPr>
         <w:fldChar w:fldCharType="end"/>
       </w:r>
-      <w:commentRangeEnd w:id="10"/>
+      <w:commentRangeEnd w:id="9"/>
       <w:r>
         <w:rPr>
           <w:rStyle w:val="Refdecomentario"/>
         </w:rPr>
-        <w:commentReference w:id="10"/>
+        <w:commentReference w:id="9"/>
       </w:r>
     </w:p>
     <w:p>
@@ -13139,7 +13152,7 @@
                     <pic:cNvPicPr/>
                   </pic:nvPicPr>
                   <pic:blipFill>
-                    <a:blip r:embed="rId15">
+                    <a:blip r:embed="rId16">
                       <a:extLst>
                         <a:ext uri="{28A0092B-C50C-407E-A947-70E740481C1C}">
                           <a14:useLocalDpi xmlns:a14="http://schemas.microsoft.com/office/drawing/2010/main" val="0"/>
@@ -13165,11 +13178,13 @@
           </wp:inline>
         </w:drawing>
       </w:r>
+      <w:commentRangeStart w:id="10"/>
+      <w:commentRangeEnd w:id="10"/>
       <w:r>
         <w:rPr>
           <w:rStyle w:val="Refdecomentario"/>
         </w:rPr>
-        <w:commentReference w:id="11"/>
+        <w:commentReference w:id="10"/>
       </w:r>
     </w:p>
     <w:p>
@@ -13263,7 +13278,7 @@
                     <pic:cNvPicPr/>
                   </pic:nvPicPr>
                   <pic:blipFill>
-                    <a:blip r:embed="rId16">
+                    <a:blip r:embed="rId17">
                       <a:extLst>
                         <a:ext uri="{28A0092B-C50C-407E-A947-70E740481C1C}">
                           <a14:useLocalDpi xmlns:a14="http://schemas.microsoft.com/office/drawing/2010/main" val="0"/>
@@ -13556,7 +13571,6 @@
           <w:p>
             <w:pPr>
               <w:pStyle w:val="Ttulo1"/>
-              <w:outlineLvl w:val="0"/>
               <w:rPr>
                 <w:sz w:val="22"/>
                 <w:szCs w:val="22"/>
@@ -13664,7 +13678,7 @@
                 <w:szCs w:val="22"/>
               </w:rPr>
             </w:pPr>
-            <w:hyperlink r:id="rId17" w:history="1">
+            <w:hyperlink r:id="rId18" w:history="1">
               <w:r>
                 <w:rPr>
                   <w:rStyle w:val="Hipervnculo"/>
@@ -13701,7 +13715,6 @@
           <w:p>
             <w:pPr>
               <w:pStyle w:val="Ttulo1"/>
-              <w:outlineLvl w:val="0"/>
               <w:rPr>
                 <w:bCs/>
                 <w:sz w:val="22"/>
@@ -13805,7 +13818,7 @@
                 <w:szCs w:val="22"/>
               </w:rPr>
             </w:pPr>
-            <w:hyperlink r:id="rId18" w:history="1">
+            <w:hyperlink r:id="rId19" w:history="1">
               <w:r>
                 <w:rPr>
                   <w:rStyle w:val="Hipervnculo"/>
@@ -13931,7 +13944,7 @@
             </w:tcMar>
           </w:tcPr>
           <w:p>
-            <w:hyperlink r:id="rId19" w:history="1">
+            <w:hyperlink r:id="rId20" w:history="1">
               <w:r>
                 <w:rPr>
                   <w:rStyle w:val="Hipervnculo"/>
@@ -15286,7 +15299,7 @@
       <w:pPr>
         <w:pStyle w:val="Normal0"/>
       </w:pPr>
-      <w:hyperlink r:id="rId20" w:history="1">
+      <w:hyperlink r:id="rId21" w:history="1">
         <w:r>
           <w:rPr>
             <w:rStyle w:val="Hipervnculo"/>
@@ -15307,7 +15320,7 @@
       <w:r>
         <w:t xml:space="preserve">Constitución Política de Colombia. (1991). Artículo 49 – Atención en salud y saneamiento ambiental. Constitución Política de Colombia. Recuperado de </w:t>
       </w:r>
-      <w:hyperlink r:id="rId21" w:history="1">
+      <w:hyperlink r:id="rId22" w:history="1">
         <w:r>
           <w:rPr>
             <w:rStyle w:val="Hipervnculo"/>
@@ -15334,7 +15347,7 @@
       <w:r>
         <w:t xml:space="preserve">alud, 15(1), 128-143. Recuperado de </w:t>
       </w:r>
-      <w:hyperlink r:id="rId22" w:history="1">
+      <w:hyperlink r:id="rId23" w:history="1">
         <w:r>
           <w:rPr>
             <w:rStyle w:val="Hipervnculo"/>
@@ -16041,8 +16054,8 @@
       </w:pPr>
     </w:p>
     <w:sectPr>
-      <w:headerReference w:type="default" r:id="rId23"/>
-      <w:footerReference w:type="default" r:id="rId24"/>
+      <w:headerReference w:type="default" r:id="rId24"/>
+      <w:footerReference w:type="default" r:id="rId25"/>
       <w:pgSz w:w="12240" w:h="15840"/>
       <w:pgMar w:top="1701" w:right="1134" w:bottom="1134" w:left="1134" w:header="720" w:footer="0" w:gutter="0"/>
       <w:pgNumType w:start="1"/>
@@ -16053,8 +16066,8 @@
 </file>
 
 <file path=word/comments.xml><?xml version="1.0" encoding="utf-8"?>
-<w:comments xmlns:wpc="http://schemas.microsoft.com/office/word/2010/wordprocessingCanvas" xmlns:mc="http://schemas.openxmlformats.org/markup-compatibility/2006" xmlns:o="urn:schemas-microsoft-com:office:office" xmlns:r="http://schemas.openxmlformats.org/officeDocument/2006/relationships" xmlns:m="http://schemas.openxmlformats.org/officeDocument/2006/math" xmlns:v="urn:schemas-microsoft-com:vml" xmlns:wp14="http://schemas.microsoft.com/office/word/2010/wordprocessingDrawing" xmlns:wp="http://schemas.openxmlformats.org/drawingml/2006/wordprocessingDrawing" xmlns:w10="urn:schemas-microsoft-com:office:word" xmlns:w="http://schemas.openxmlformats.org/wordprocessingml/2006/main" xmlns:w14="http://schemas.microsoft.com/office/word/2010/wordml" xmlns:w15="http://schemas.microsoft.com/office/word/2012/wordml" xmlns:wpg="http://schemas.microsoft.com/office/word/2010/wordprocessingGroup" xmlns:wpi="http://schemas.microsoft.com/office/word/2010/wordprocessingInk" xmlns:wne="http://schemas.microsoft.com/office/word/2006/wordml" xmlns:wps="http://schemas.microsoft.com/office/word/2010/wordprocessingShape" mc:Ignorable="w14 w15 wp14">
-  <w:comment w:id="1" w:author="LauraPGM" w:date="2025-03-18T16:31:00Z" w:initials="L">
+<w:comments xmlns:wpc="http://schemas.microsoft.com/office/word/2010/wordprocessingCanvas" xmlns:cx="http://schemas.microsoft.com/office/drawing/2014/chartex" xmlns:cx1="http://schemas.microsoft.com/office/drawing/2015/9/8/chartex" xmlns:cx2="http://schemas.microsoft.com/office/drawing/2015/10/21/chartex" xmlns:cx3="http://schemas.microsoft.com/office/drawing/2016/5/9/chartex" xmlns:cx4="http://schemas.microsoft.com/office/drawing/2016/5/10/chartex" xmlns:cx5="http://schemas.microsoft.com/office/drawing/2016/5/11/chartex" xmlns:cx6="http://schemas.microsoft.com/office/drawing/2016/5/12/chartex" xmlns:cx7="http://schemas.microsoft.com/office/drawing/2016/5/13/chartex" xmlns:cx8="http://schemas.microsoft.com/office/drawing/2016/5/14/chartex" xmlns:mc="http://schemas.openxmlformats.org/markup-compatibility/2006" xmlns:aink="http://schemas.microsoft.com/office/drawing/2016/ink" xmlns:am3d="http://schemas.microsoft.com/office/drawing/2017/model3d" xmlns:o="urn:schemas-microsoft-com:office:office" xmlns:oel="http://schemas.microsoft.com/office/2019/extlst" xmlns:r="http://schemas.openxmlformats.org/officeDocument/2006/relationships" xmlns:m="http://schemas.openxmlformats.org/officeDocument/2006/math" xmlns:v="urn:schemas-microsoft-com:vml" xmlns:wp14="http://schemas.microsoft.com/office/word/2010/wordprocessingDrawing" xmlns:wp="http://schemas.openxmlformats.org/drawingml/2006/wordprocessingDrawing" xmlns:w10="urn:schemas-microsoft-com:office:word" xmlns:w="http://schemas.openxmlformats.org/wordprocessingml/2006/main" xmlns:w14="http://schemas.microsoft.com/office/word/2010/wordml" xmlns:w15="http://schemas.microsoft.com/office/word/2012/wordml" xmlns:w16cex="http://schemas.microsoft.com/office/word/2018/wordml/cex" xmlns:w16cid="http://schemas.microsoft.com/office/word/2016/wordml/cid" xmlns:w16="http://schemas.microsoft.com/office/word/2018/wordml" xmlns:w16du="http://schemas.microsoft.com/office/word/2023/wordml/word16du" xmlns:w16sdtdh="http://schemas.microsoft.com/office/word/2020/wordml/sdtdatahash" xmlns:w16sdtfl="http://schemas.microsoft.com/office/word/2024/wordml/sdtformatlock" xmlns:w16se="http://schemas.microsoft.com/office/word/2015/wordml/symex" xmlns:wpg="http://schemas.microsoft.com/office/word/2010/wordprocessingGroup" xmlns:wpi="http://schemas.microsoft.com/office/word/2010/wordprocessingInk" xmlns:wne="http://schemas.microsoft.com/office/word/2006/wordml" xmlns:wps="http://schemas.microsoft.com/office/word/2010/wordprocessingShape" mc:Ignorable="w14 w15 w16se w16cid w16 w16cex w16sdtdh w16sdtfl w16du wp14">
+  <w:comment w:id="0" w:author="LauraPGM" w:date="2025-03-18T16:31:00Z" w:initials="L">
     <w:p>
       <w:r>
         <w:rPr>
@@ -16080,11 +16093,33 @@
       </w:pPr>
     </w:p>
   </w:comment>
-  <w:comment w:id="2" w:author="LauraPGM" w:date="2025-03-18T10:33:00Z" w:initials="L">
+  <w:comment w:id="1" w:author="LauraPGM" w:date="2025-03-18T10:33:00Z" w:initials="L">
     <w:p>
       <w:pPr>
         <w:pStyle w:val="Textocomentario"/>
       </w:pPr>
+      <w:r>
+        <w:rPr>
+          <w:rStyle w:val="Refdecomentario"/>
+        </w:rPr>
+        <w:annotationRef/>
+      </w:r>
+      <w:r>
+        <w:t>Solo resaltar información</w:t>
+      </w:r>
+    </w:p>
+  </w:comment>
+  <w:comment w:id="2" w:author="LauraPGM" w:date="2025-03-18T10:35:00Z" w:initials="L">
+    <w:p>
+      <w:pPr>
+        <w:pStyle w:val="Textocomentario"/>
+      </w:pPr>
+      <w:r>
+        <w:rPr>
+          <w:rStyle w:val="Refdecomentario"/>
+        </w:rPr>
+        <w:annotationRef/>
+      </w:r>
       <w:r>
         <w:rPr>
           <w:rStyle w:val="Refdecomentario"/>
@@ -16117,8 +16152,13 @@
         <w:t>Solo resaltar información</w:t>
       </w:r>
     </w:p>
+    <w:p>
+      <w:pPr>
+        <w:pStyle w:val="Textocomentario"/>
+      </w:pPr>
+    </w:p>
   </w:comment>
-  <w:comment w:id="4" w:author="LauraPGM" w:date="2025-03-18T10:35:00Z" w:initials="L">
+  <w:comment w:id="4" w:author="LauraPGM" w:date="2025-03-18T10:36:00Z" w:initials="L">
     <w:p>
       <w:pPr>
         <w:pStyle w:val="Textocomentario"/>
@@ -16145,7 +16185,7 @@
       </w:pPr>
     </w:p>
   </w:comment>
-  <w:comment w:id="5" w:author="LauraPGM" w:date="2025-03-18T10:36:00Z" w:initials="L">
+  <w:comment w:id="5" w:author="LauraPGM" w:date="2025-04-03T09:36:00Z" w:initials="L">
     <w:p>
       <w:pPr>
         <w:pStyle w:val="Textocomentario"/>
@@ -16157,38 +16197,11 @@
         <w:annotationRef/>
       </w:r>
       <w:r>
-        <w:rPr>
-          <w:rStyle w:val="Refdecomentario"/>
-        </w:rPr>
-        <w:annotationRef/>
-      </w:r>
-      <w:r>
-        <w:t>Solo resaltar información</w:t>
-      </w:r>
-    </w:p>
-    <w:p>
-      <w:pPr>
-        <w:pStyle w:val="Textocomentario"/>
-      </w:pPr>
+        <w:t>Texto alternativo: Tabla que muestra el marco normativo para la promoción de la salud en Colombia, incluyendo leyes, resoluciones, decretos y circulares emitidas entre 1993 y 2008. Establece directrices para el sistema de seguridad social en salud (SGSSS), protocolos de atención, estrategias de salud pública, planes nacionales, enfoques intersectoriales, y regulación de planes territoriales y colectivos de salud.</w:t>
+      </w:r>
     </w:p>
   </w:comment>
-  <w:comment w:id="6" w:author="LauraPGM" w:date="2025-04-03T09:36:00Z" w:initials="L">
-    <w:p>
-      <w:pPr>
-        <w:pStyle w:val="Textocomentario"/>
-      </w:pPr>
-      <w:r>
-        <w:rPr>
-          <w:rStyle w:val="Refdecomentario"/>
-        </w:rPr>
-        <w:annotationRef/>
-      </w:r>
-      <w:r>
-        <w:t>Texto alternativo: Tabla que muestra el marco normativo para la promoción de la salud en Colombia, incluyendo leyes, resoluciones, decretos y circulares emitidas entre 1993 y 2008. Establece directrices para el sistema de seguridad social en salud (SGSSS), protocolos de atención, estrategias de salud pública, planes nacionales, enfoques intersectoriales, y regulación de planes territoriales y colectivos de salud.</w:t>
-      </w:r>
-    </w:p>
-  </w:comment>
-  <w:comment w:id="7" w:author="LauraPGM" w:date="2025-03-18T16:34:00Z" w:initials="L">
+  <w:comment w:id="6" w:author="LauraPGM" w:date="2025-03-18T16:34:00Z" w:initials="L">
     <w:p>
       <w:pPr>
         <w:pStyle w:val="Textocomentario"/>
@@ -16272,7 +16285,7 @@
       </w:r>
     </w:p>
   </w:comment>
-  <w:comment w:id="8" w:author="LauraPGM" w:date="2025-04-03T09:38:00Z" w:initials="L">
+  <w:comment w:id="7" w:author="LauraPGM" w:date="2025-04-03T09:38:00Z" w:initials="L">
     <w:p>
       <w:pPr>
         <w:pStyle w:val="Textocomentario"/>
@@ -16288,7 +16301,7 @@
       </w:r>
     </w:p>
   </w:comment>
-  <w:comment w:id="9" w:author="LauraPGM" w:date="2025-03-18T16:23:00Z" w:initials="L">
+  <w:comment w:id="8" w:author="LauraPGM" w:date="2025-03-18T16:23:00Z" w:initials="L">
     <w:p>
       <w:pPr>
         <w:pStyle w:val="Textocomentario"/>
@@ -16326,7 +16339,7 @@
       </w:pPr>
     </w:p>
   </w:comment>
-  <w:comment w:id="10" w:author="LauraPGM" w:date="2025-03-18T16:30:00Z" w:initials="L">
+  <w:comment w:id="9" w:author="LauraPGM" w:date="2025-03-18T16:30:00Z" w:initials="L">
     <w:p>
       <w:pPr>
         <w:spacing w:line="360" w:lineRule="auto"/>
@@ -16374,7 +16387,7 @@
       </w:r>
     </w:p>
   </w:comment>
-  <w:comment w:id="11" w:author="LauraPGM" w:date="2025-04-03T09:39:00Z" w:initials="L">
+  <w:comment w:id="10" w:author="LauraPGM" w:date="2025-04-03T09:39:00Z" w:initials="L">
     <w:p>
       <w:pPr>
         <w:pStyle w:val="Textocomentario"/>
@@ -16394,7 +16407,7 @@
 </file>
 
 <file path=word/commentsExtended.xml><?xml version="1.0" encoding="utf-8"?>
-<w15:commentsEx xmlns:wpc="http://schemas.microsoft.com/office/word/2010/wordprocessingCanvas" xmlns:mc="http://schemas.openxmlformats.org/markup-compatibility/2006" xmlns:o="urn:schemas-microsoft-com:office:office" xmlns:r="http://schemas.openxmlformats.org/officeDocument/2006/relationships" xmlns:m="http://schemas.openxmlformats.org/officeDocument/2006/math" xmlns:v="urn:schemas-microsoft-com:vml" xmlns:wp14="http://schemas.microsoft.com/office/word/2010/wordprocessingDrawing" xmlns:wp="http://schemas.openxmlformats.org/drawingml/2006/wordprocessingDrawing" xmlns:w10="urn:schemas-microsoft-com:office:word" xmlns:w="http://schemas.openxmlformats.org/wordprocessingml/2006/main" xmlns:w14="http://schemas.microsoft.com/office/word/2010/wordml" xmlns:w15="http://schemas.microsoft.com/office/word/2012/wordml" xmlns:wpg="http://schemas.microsoft.com/office/word/2010/wordprocessingGroup" xmlns:wpi="http://schemas.microsoft.com/office/word/2010/wordprocessingInk" xmlns:wne="http://schemas.microsoft.com/office/word/2006/wordml" xmlns:wps="http://schemas.microsoft.com/office/word/2010/wordprocessingShape" mc:Ignorable="w14 w15 wp14">
+<w15:commentsEx xmlns:wpc="http://schemas.microsoft.com/office/word/2010/wordprocessingCanvas" xmlns:cx="http://schemas.microsoft.com/office/drawing/2014/chartex" xmlns:cx1="http://schemas.microsoft.com/office/drawing/2015/9/8/chartex" xmlns:cx2="http://schemas.microsoft.com/office/drawing/2015/10/21/chartex" xmlns:cx3="http://schemas.microsoft.com/office/drawing/2016/5/9/chartex" xmlns:cx4="http://schemas.microsoft.com/office/drawing/2016/5/10/chartex" xmlns:cx5="http://schemas.microsoft.com/office/drawing/2016/5/11/chartex" xmlns:cx6="http://schemas.microsoft.com/office/drawing/2016/5/12/chartex" xmlns:cx7="http://schemas.microsoft.com/office/drawing/2016/5/13/chartex" xmlns:cx8="http://schemas.microsoft.com/office/drawing/2016/5/14/chartex" xmlns:mc="http://schemas.openxmlformats.org/markup-compatibility/2006" xmlns:aink="http://schemas.microsoft.com/office/drawing/2016/ink" xmlns:am3d="http://schemas.microsoft.com/office/drawing/2017/model3d" xmlns:o="urn:schemas-microsoft-com:office:office" xmlns:oel="http://schemas.microsoft.com/office/2019/extlst" xmlns:r="http://schemas.openxmlformats.org/officeDocument/2006/relationships" xmlns:m="http://schemas.openxmlformats.org/officeDocument/2006/math" xmlns:v="urn:schemas-microsoft-com:vml" xmlns:wp14="http://schemas.microsoft.com/office/word/2010/wordprocessingDrawing" xmlns:wp="http://schemas.openxmlformats.org/drawingml/2006/wordprocessingDrawing" xmlns:w10="urn:schemas-microsoft-com:office:word" xmlns:w="http://schemas.openxmlformats.org/wordprocessingml/2006/main" xmlns:w14="http://schemas.microsoft.com/office/word/2010/wordml" xmlns:w15="http://schemas.microsoft.com/office/word/2012/wordml" xmlns:w16cex="http://schemas.microsoft.com/office/word/2018/wordml/cex" xmlns:w16cid="http://schemas.microsoft.com/office/word/2016/wordml/cid" xmlns:w16="http://schemas.microsoft.com/office/word/2018/wordml" xmlns:w16du="http://schemas.microsoft.com/office/word/2023/wordml/word16du" xmlns:w16sdtdh="http://schemas.microsoft.com/office/word/2020/wordml/sdtdatahash" xmlns:w16sdtfl="http://schemas.microsoft.com/office/word/2024/wordml/sdtformatlock" xmlns:w16se="http://schemas.microsoft.com/office/word/2015/wordml/symex" xmlns:wpg="http://schemas.microsoft.com/office/word/2010/wordprocessingGroup" xmlns:wpi="http://schemas.microsoft.com/office/word/2010/wordprocessingInk" xmlns:wne="http://schemas.microsoft.com/office/word/2006/wordml" xmlns:wps="http://schemas.microsoft.com/office/word/2010/wordprocessingShape" mc:Ignorable="w14 w15 w16se w16cid w16 w16cex w16sdtdh w16sdtfl w16du wp14">
   <w15:commentEx w15:paraId="27AA662C" w15:done="0"/>
   <w15:commentEx w15:paraId="0AD58C47" w15:done="0"/>
   <w15:commentEx w15:paraId="51121AF1" w15:done="0"/>
@@ -16409,8 +16422,24 @@
 </w15:commentsEx>
 </file>
 
+<file path=word/commentsIds.xml><?xml version="1.0" encoding="utf-8"?>
+<w16cid:commentsIds xmlns:wpc="http://schemas.microsoft.com/office/word/2010/wordprocessingCanvas" xmlns:cx="http://schemas.microsoft.com/office/drawing/2014/chartex" xmlns:cx1="http://schemas.microsoft.com/office/drawing/2015/9/8/chartex" xmlns:cx2="http://schemas.microsoft.com/office/drawing/2015/10/21/chartex" xmlns:cx3="http://schemas.microsoft.com/office/drawing/2016/5/9/chartex" xmlns:cx4="http://schemas.microsoft.com/office/drawing/2016/5/10/chartex" xmlns:cx5="http://schemas.microsoft.com/office/drawing/2016/5/11/chartex" xmlns:cx6="http://schemas.microsoft.com/office/drawing/2016/5/12/chartex" xmlns:cx7="http://schemas.microsoft.com/office/drawing/2016/5/13/chartex" xmlns:cx8="http://schemas.microsoft.com/office/drawing/2016/5/14/chartex" xmlns:mc="http://schemas.openxmlformats.org/markup-compatibility/2006" xmlns:aink="http://schemas.microsoft.com/office/drawing/2016/ink" xmlns:am3d="http://schemas.microsoft.com/office/drawing/2017/model3d" xmlns:o="urn:schemas-microsoft-com:office:office" xmlns:oel="http://schemas.microsoft.com/office/2019/extlst" xmlns:r="http://schemas.openxmlformats.org/officeDocument/2006/relationships" xmlns:m="http://schemas.openxmlformats.org/officeDocument/2006/math" xmlns:v="urn:schemas-microsoft-com:vml" xmlns:wp14="http://schemas.microsoft.com/office/word/2010/wordprocessingDrawing" xmlns:wp="http://schemas.openxmlformats.org/drawingml/2006/wordprocessingDrawing" xmlns:w10="urn:schemas-microsoft-com:office:word" xmlns:w="http://schemas.openxmlformats.org/wordprocessingml/2006/main" xmlns:w14="http://schemas.microsoft.com/office/word/2010/wordml" xmlns:w15="http://schemas.microsoft.com/office/word/2012/wordml" xmlns:w16cex="http://schemas.microsoft.com/office/word/2018/wordml/cex" xmlns:w16cid="http://schemas.microsoft.com/office/word/2016/wordml/cid" xmlns:w16="http://schemas.microsoft.com/office/word/2018/wordml" xmlns:w16du="http://schemas.microsoft.com/office/word/2023/wordml/word16du" xmlns:w16sdtdh="http://schemas.microsoft.com/office/word/2020/wordml/sdtdatahash" xmlns:w16sdtfl="http://schemas.microsoft.com/office/word/2024/wordml/sdtformatlock" xmlns:w16se="http://schemas.microsoft.com/office/word/2015/wordml/symex" xmlns:wpg="http://schemas.microsoft.com/office/word/2010/wordprocessingGroup" xmlns:wpi="http://schemas.microsoft.com/office/word/2010/wordprocessingInk" xmlns:wne="http://schemas.microsoft.com/office/word/2006/wordml" xmlns:wps="http://schemas.microsoft.com/office/word/2010/wordprocessingShape" mc:Ignorable="w14 w15 w16se w16cid w16 w16cex w16sdtdh w16sdtfl w16du wp14">
+  <w16cid:commentId w16cid:paraId="27AA662C" w16cid:durableId="27AA662C"/>
+  <w16cid:commentId w16cid:paraId="0AD58C47" w16cid:durableId="0AD58C47"/>
+  <w16cid:commentId w16cid:paraId="51121AF1" w16cid:durableId="51121AF1"/>
+  <w16cid:commentId w16cid:paraId="2A7F386F" w16cid:durableId="2A7F386F"/>
+  <w16cid:commentId w16cid:paraId="73CE3FFD" w16cid:durableId="73CE3FFD"/>
+  <w16cid:commentId w16cid:paraId="567DBFE3" w16cid:durableId="567DBFE3"/>
+  <w16cid:commentId w16cid:paraId="75B1D811" w16cid:durableId="75B1D811"/>
+  <w16cid:commentId w16cid:paraId="0936198E" w16cid:durableId="0936198E"/>
+  <w16cid:commentId w16cid:paraId="1C59613A" w16cid:durableId="1C59613A"/>
+  <w16cid:commentId w16cid:paraId="587DC5FF" w16cid:durableId="587DC5FF"/>
+  <w16cid:commentId w16cid:paraId="23F8DEE7" w16cid:durableId="23F8DEE7"/>
+</w16cid:commentsIds>
+</file>
+
 <file path=word/endnotes.xml><?xml version="1.0" encoding="utf-8"?>
-<w:endnotes xmlns:wpc="http://schemas.microsoft.com/office/word/2010/wordprocessingCanvas" xmlns:mc="http://schemas.openxmlformats.org/markup-compatibility/2006" xmlns:o="urn:schemas-microsoft-com:office:office" xmlns:r="http://schemas.openxmlformats.org/officeDocument/2006/relationships" xmlns:m="http://schemas.openxmlformats.org/officeDocument/2006/math" xmlns:v="urn:schemas-microsoft-com:vml" xmlns:wp14="http://schemas.microsoft.com/office/word/2010/wordprocessingDrawing" xmlns:wp="http://schemas.openxmlformats.org/drawingml/2006/wordprocessingDrawing" xmlns:w10="urn:schemas-microsoft-com:office:word" xmlns:w="http://schemas.openxmlformats.org/wordprocessingml/2006/main" xmlns:w14="http://schemas.microsoft.com/office/word/2010/wordml" xmlns:w15="http://schemas.microsoft.com/office/word/2012/wordml" xmlns:wpg="http://schemas.microsoft.com/office/word/2010/wordprocessingGroup" xmlns:wpi="http://schemas.microsoft.com/office/word/2010/wordprocessingInk" xmlns:wne="http://schemas.microsoft.com/office/word/2006/wordml" xmlns:wps="http://schemas.microsoft.com/office/word/2010/wordprocessingShape" mc:Ignorable="w14 w15 wp14">
+<w:endnotes xmlns:wpc="http://schemas.microsoft.com/office/word/2010/wordprocessingCanvas" xmlns:cx="http://schemas.microsoft.com/office/drawing/2014/chartex" xmlns:cx1="http://schemas.microsoft.com/office/drawing/2015/9/8/chartex" xmlns:cx2="http://schemas.microsoft.com/office/drawing/2015/10/21/chartex" xmlns:cx3="http://schemas.microsoft.com/office/drawing/2016/5/9/chartex" xmlns:cx4="http://schemas.microsoft.com/office/drawing/2016/5/10/chartex" xmlns:cx5="http://schemas.microsoft.com/office/drawing/2016/5/11/chartex" xmlns:cx6="http://schemas.microsoft.com/office/drawing/2016/5/12/chartex" xmlns:cx7="http://schemas.microsoft.com/office/drawing/2016/5/13/chartex" xmlns:cx8="http://schemas.microsoft.com/office/drawing/2016/5/14/chartex" xmlns:mc="http://schemas.openxmlformats.org/markup-compatibility/2006" xmlns:aink="http://schemas.microsoft.com/office/drawing/2016/ink" xmlns:am3d="http://schemas.microsoft.com/office/drawing/2017/model3d" xmlns:o="urn:schemas-microsoft-com:office:office" xmlns:oel="http://schemas.microsoft.com/office/2019/extlst" xmlns:r="http://schemas.openxmlformats.org/officeDocument/2006/relationships" xmlns:m="http://schemas.openxmlformats.org/officeDocument/2006/math" xmlns:v="urn:schemas-microsoft-com:vml" xmlns:wp14="http://schemas.microsoft.com/office/word/2010/wordprocessingDrawing" xmlns:wp="http://schemas.openxmlformats.org/drawingml/2006/wordprocessingDrawing" xmlns:w10="urn:schemas-microsoft-com:office:word" xmlns:w="http://schemas.openxmlformats.org/wordprocessingml/2006/main" xmlns:w14="http://schemas.microsoft.com/office/word/2010/wordml" xmlns:w15="http://schemas.microsoft.com/office/word/2012/wordml" xmlns:w16cex="http://schemas.microsoft.com/office/word/2018/wordml/cex" xmlns:w16cid="http://schemas.microsoft.com/office/word/2016/wordml/cid" xmlns:w16="http://schemas.microsoft.com/office/word/2018/wordml" xmlns:w16du="http://schemas.microsoft.com/office/word/2023/wordml/word16du" xmlns:w16sdtdh="http://schemas.microsoft.com/office/word/2020/wordml/sdtdatahash" xmlns:w16sdtfl="http://schemas.microsoft.com/office/word/2024/wordml/sdtformatlock" xmlns:w16se="http://schemas.microsoft.com/office/word/2015/wordml/symex" xmlns:wpg="http://schemas.microsoft.com/office/word/2010/wordprocessingGroup" xmlns:wpi="http://schemas.microsoft.com/office/word/2010/wordprocessingInk" xmlns:wne="http://schemas.microsoft.com/office/word/2006/wordml" xmlns:wps="http://schemas.microsoft.com/office/word/2010/wordprocessingShape" mc:Ignorable="w14 w15 w16se w16cid w16 w16cex w16sdtdh w16sdtfl w16du wp14">
   <w:endnote w:type="separator" w:id="-1">
     <w:p>
       <w:pPr>
@@ -16435,7 +16464,7 @@
 </file>
 
 <file path=word/footer1.xml><?xml version="1.0" encoding="utf-8"?>
-<w:ftr xmlns:wpc="http://schemas.microsoft.com/office/word/2010/wordprocessingCanvas" xmlns:mc="http://schemas.openxmlformats.org/markup-compatibility/2006" xmlns:o="urn:schemas-microsoft-com:office:office" xmlns:r="http://schemas.openxmlformats.org/officeDocument/2006/relationships" xmlns:m="http://schemas.openxmlformats.org/officeDocument/2006/math" xmlns:v="urn:schemas-microsoft-com:vml" xmlns:wp14="http://schemas.microsoft.com/office/word/2010/wordprocessingDrawing" xmlns:wp="http://schemas.openxmlformats.org/drawingml/2006/wordprocessingDrawing" xmlns:w10="urn:schemas-microsoft-com:office:word" xmlns:w="http://schemas.openxmlformats.org/wordprocessingml/2006/main" xmlns:w14="http://schemas.microsoft.com/office/word/2010/wordml" xmlns:w15="http://schemas.microsoft.com/office/word/2012/wordml" xmlns:wpg="http://schemas.microsoft.com/office/word/2010/wordprocessingGroup" xmlns:wpi="http://schemas.microsoft.com/office/word/2010/wordprocessingInk" xmlns:wne="http://schemas.microsoft.com/office/word/2006/wordml" xmlns:wps="http://schemas.microsoft.com/office/word/2010/wordprocessingShape" mc:Ignorable="w14 w15 wp14">
+<w:ftr xmlns:wpc="http://schemas.microsoft.com/office/word/2010/wordprocessingCanvas" xmlns:cx="http://schemas.microsoft.com/office/drawing/2014/chartex" xmlns:cx1="http://schemas.microsoft.com/office/drawing/2015/9/8/chartex" xmlns:cx2="http://schemas.microsoft.com/office/drawing/2015/10/21/chartex" xmlns:cx3="http://schemas.microsoft.com/office/drawing/2016/5/9/chartex" xmlns:cx4="http://schemas.microsoft.com/office/drawing/2016/5/10/chartex" xmlns:cx5="http://schemas.microsoft.com/office/drawing/2016/5/11/chartex" xmlns:cx6="http://schemas.microsoft.com/office/drawing/2016/5/12/chartex" xmlns:cx7="http://schemas.microsoft.com/office/drawing/2016/5/13/chartex" xmlns:cx8="http://schemas.microsoft.com/office/drawing/2016/5/14/chartex" xmlns:mc="http://schemas.openxmlformats.org/markup-compatibility/2006" xmlns:aink="http://schemas.microsoft.com/office/drawing/2016/ink" xmlns:am3d="http://schemas.microsoft.com/office/drawing/2017/model3d" xmlns:o="urn:schemas-microsoft-com:office:office" xmlns:oel="http://schemas.microsoft.com/office/2019/extlst" xmlns:r="http://schemas.openxmlformats.org/officeDocument/2006/relationships" xmlns:m="http://schemas.openxmlformats.org/officeDocument/2006/math" xmlns:v="urn:schemas-microsoft-com:vml" xmlns:wp14="http://schemas.microsoft.com/office/word/2010/wordprocessingDrawing" xmlns:wp="http://schemas.openxmlformats.org/drawingml/2006/wordprocessingDrawing" xmlns:w10="urn:schemas-microsoft-com:office:word" xmlns:w="http://schemas.openxmlformats.org/wordprocessingml/2006/main" xmlns:w14="http://schemas.microsoft.com/office/word/2010/wordml" xmlns:w15="http://schemas.microsoft.com/office/word/2012/wordml" xmlns:w16cex="http://schemas.microsoft.com/office/word/2018/wordml/cex" xmlns:w16cid="http://schemas.microsoft.com/office/word/2016/wordml/cid" xmlns:w16="http://schemas.microsoft.com/office/word/2018/wordml" xmlns:w16du="http://schemas.microsoft.com/office/word/2023/wordml/word16du" xmlns:w16sdtdh="http://schemas.microsoft.com/office/word/2020/wordml/sdtdatahash" xmlns:w16sdtfl="http://schemas.microsoft.com/office/word/2024/wordml/sdtformatlock" xmlns:w16se="http://schemas.microsoft.com/office/word/2015/wordml/symex" xmlns:wpg="http://schemas.microsoft.com/office/word/2010/wordprocessingGroup" xmlns:wpi="http://schemas.microsoft.com/office/word/2010/wordprocessingInk" xmlns:wne="http://schemas.microsoft.com/office/word/2006/wordml" xmlns:wps="http://schemas.microsoft.com/office/word/2010/wordprocessingShape" mc:Ignorable="w14 w15 w16se w16cid w16 w16cex w16sdtdh w16sdtfl w16du wp14">
   <w:p>
     <w:pPr>
       <w:pStyle w:val="Normal0"/>
@@ -16539,7 +16568,7 @@
 </file>
 
 <file path=word/footnotes.xml><?xml version="1.0" encoding="utf-8"?>
-<w:footnotes xmlns:wpc="http://schemas.microsoft.com/office/word/2010/wordprocessingCanvas" xmlns:mc="http://schemas.openxmlformats.org/markup-compatibility/2006" xmlns:o="urn:schemas-microsoft-com:office:office" xmlns:r="http://schemas.openxmlformats.org/officeDocument/2006/relationships" xmlns:m="http://schemas.openxmlformats.org/officeDocument/2006/math" xmlns:v="urn:schemas-microsoft-com:vml" xmlns:wp14="http://schemas.microsoft.com/office/word/2010/wordprocessingDrawing" xmlns:wp="http://schemas.openxmlformats.org/drawingml/2006/wordprocessingDrawing" xmlns:w10="urn:schemas-microsoft-com:office:word" xmlns:w="http://schemas.openxmlformats.org/wordprocessingml/2006/main" xmlns:w14="http://schemas.microsoft.com/office/word/2010/wordml" xmlns:w15="http://schemas.microsoft.com/office/word/2012/wordml" xmlns:wpg="http://schemas.microsoft.com/office/word/2010/wordprocessingGroup" xmlns:wpi="http://schemas.microsoft.com/office/word/2010/wordprocessingInk" xmlns:wne="http://schemas.microsoft.com/office/word/2006/wordml" xmlns:wps="http://schemas.microsoft.com/office/word/2010/wordprocessingShape" mc:Ignorable="w14 w15 wp14">
+<w:footnotes xmlns:wpc="http://schemas.microsoft.com/office/word/2010/wordprocessingCanvas" xmlns:cx="http://schemas.microsoft.com/office/drawing/2014/chartex" xmlns:cx1="http://schemas.microsoft.com/office/drawing/2015/9/8/chartex" xmlns:cx2="http://schemas.microsoft.com/office/drawing/2015/10/21/chartex" xmlns:cx3="http://schemas.microsoft.com/office/drawing/2016/5/9/chartex" xmlns:cx4="http://schemas.microsoft.com/office/drawing/2016/5/10/chartex" xmlns:cx5="http://schemas.microsoft.com/office/drawing/2016/5/11/chartex" xmlns:cx6="http://schemas.microsoft.com/office/drawing/2016/5/12/chartex" xmlns:cx7="http://schemas.microsoft.com/office/drawing/2016/5/13/chartex" xmlns:cx8="http://schemas.microsoft.com/office/drawing/2016/5/14/chartex" xmlns:mc="http://schemas.openxmlformats.org/markup-compatibility/2006" xmlns:aink="http://schemas.microsoft.com/office/drawing/2016/ink" xmlns:am3d="http://schemas.microsoft.com/office/drawing/2017/model3d" xmlns:o="urn:schemas-microsoft-com:office:office" xmlns:oel="http://schemas.microsoft.com/office/2019/extlst" xmlns:r="http://schemas.openxmlformats.org/officeDocument/2006/relationships" xmlns:m="http://schemas.openxmlformats.org/officeDocument/2006/math" xmlns:v="urn:schemas-microsoft-com:vml" xmlns:wp14="http://schemas.microsoft.com/office/word/2010/wordprocessingDrawing" xmlns:wp="http://schemas.openxmlformats.org/drawingml/2006/wordprocessingDrawing" xmlns:w10="urn:schemas-microsoft-com:office:word" xmlns:w="http://schemas.openxmlformats.org/wordprocessingml/2006/main" xmlns:w14="http://schemas.microsoft.com/office/word/2010/wordml" xmlns:w15="http://schemas.microsoft.com/office/word/2012/wordml" xmlns:w16cex="http://schemas.microsoft.com/office/word/2018/wordml/cex" xmlns:w16cid="http://schemas.microsoft.com/office/word/2016/wordml/cid" xmlns:w16="http://schemas.microsoft.com/office/word/2018/wordml" xmlns:w16du="http://schemas.microsoft.com/office/word/2023/wordml/word16du" xmlns:w16sdtdh="http://schemas.microsoft.com/office/word/2020/wordml/sdtdatahash" xmlns:w16sdtfl="http://schemas.microsoft.com/office/word/2024/wordml/sdtformatlock" xmlns:w16se="http://schemas.microsoft.com/office/word/2015/wordml/symex" xmlns:wpg="http://schemas.microsoft.com/office/word/2010/wordprocessingGroup" xmlns:wpi="http://schemas.microsoft.com/office/word/2010/wordprocessingInk" xmlns:wne="http://schemas.microsoft.com/office/word/2006/wordml" xmlns:wps="http://schemas.microsoft.com/office/word/2010/wordprocessingShape" mc:Ignorable="w14 w15 w16se w16cid w16 w16cex w16sdtdh w16sdtfl w16du wp14">
   <w:footnote w:type="separator" w:id="-1">
     <w:p>
       <w:pPr>
@@ -16564,7 +16593,7 @@
 </file>
 
 <file path=word/header1.xml><?xml version="1.0" encoding="utf-8"?>
-<w:hdr xmlns:wpc="http://schemas.microsoft.com/office/word/2010/wordprocessingCanvas" xmlns:mc="http://schemas.openxmlformats.org/markup-compatibility/2006" xmlns:o="urn:schemas-microsoft-com:office:office" xmlns:r="http://schemas.openxmlformats.org/officeDocument/2006/relationships" xmlns:m="http://schemas.openxmlformats.org/officeDocument/2006/math" xmlns:v="urn:schemas-microsoft-com:vml" xmlns:wp14="http://schemas.microsoft.com/office/word/2010/wordprocessingDrawing" xmlns:wp="http://schemas.openxmlformats.org/drawingml/2006/wordprocessingDrawing" xmlns:w10="urn:schemas-microsoft-com:office:word" xmlns:w="http://schemas.openxmlformats.org/wordprocessingml/2006/main" xmlns:w14="http://schemas.microsoft.com/office/word/2010/wordml" xmlns:w15="http://schemas.microsoft.com/office/word/2012/wordml" xmlns:wpg="http://schemas.microsoft.com/office/word/2010/wordprocessingGroup" xmlns:wpi="http://schemas.microsoft.com/office/word/2010/wordprocessingInk" xmlns:wne="http://schemas.microsoft.com/office/word/2006/wordml" xmlns:wps="http://schemas.microsoft.com/office/word/2010/wordprocessingShape" mc:Ignorable="w14 w15 wp14">
+<w:hdr xmlns:wpc="http://schemas.microsoft.com/office/word/2010/wordprocessingCanvas" xmlns:cx="http://schemas.microsoft.com/office/drawing/2014/chartex" xmlns:cx1="http://schemas.microsoft.com/office/drawing/2015/9/8/chartex" xmlns:cx2="http://schemas.microsoft.com/office/drawing/2015/10/21/chartex" xmlns:cx3="http://schemas.microsoft.com/office/drawing/2016/5/9/chartex" xmlns:cx4="http://schemas.microsoft.com/office/drawing/2016/5/10/chartex" xmlns:cx5="http://schemas.microsoft.com/office/drawing/2016/5/11/chartex" xmlns:cx6="http://schemas.microsoft.com/office/drawing/2016/5/12/chartex" xmlns:cx7="http://schemas.microsoft.com/office/drawing/2016/5/13/chartex" xmlns:cx8="http://schemas.microsoft.com/office/drawing/2016/5/14/chartex" xmlns:mc="http://schemas.openxmlformats.org/markup-compatibility/2006" xmlns:aink="http://schemas.microsoft.com/office/drawing/2016/ink" xmlns:am3d="http://schemas.microsoft.com/office/drawing/2017/model3d" xmlns:o="urn:schemas-microsoft-com:office:office" xmlns:oel="http://schemas.microsoft.com/office/2019/extlst" xmlns:r="http://schemas.openxmlformats.org/officeDocument/2006/relationships" xmlns:m="http://schemas.openxmlformats.org/officeDocument/2006/math" xmlns:v="urn:schemas-microsoft-com:vml" xmlns:wp14="http://schemas.microsoft.com/office/word/2010/wordprocessingDrawing" xmlns:wp="http://schemas.openxmlformats.org/drawingml/2006/wordprocessingDrawing" xmlns:w10="urn:schemas-microsoft-com:office:word" xmlns:w="http://schemas.openxmlformats.org/wordprocessingml/2006/main" xmlns:w14="http://schemas.microsoft.com/office/word/2010/wordml" xmlns:w15="http://schemas.microsoft.com/office/word/2012/wordml" xmlns:w16cex="http://schemas.microsoft.com/office/word/2018/wordml/cex" xmlns:w16cid="http://schemas.microsoft.com/office/word/2016/wordml/cid" xmlns:w16="http://schemas.microsoft.com/office/word/2018/wordml" xmlns:w16du="http://schemas.microsoft.com/office/word/2023/wordml/word16du" xmlns:w16sdtdh="http://schemas.microsoft.com/office/word/2020/wordml/sdtdatahash" xmlns:w16sdtfl="http://schemas.microsoft.com/office/word/2024/wordml/sdtformatlock" xmlns:w16se="http://schemas.microsoft.com/office/word/2015/wordml/symex" xmlns:wpg="http://schemas.microsoft.com/office/word/2010/wordprocessingGroup" xmlns:wpi="http://schemas.microsoft.com/office/word/2010/wordprocessingInk" xmlns:wne="http://schemas.microsoft.com/office/word/2006/wordml" xmlns:wps="http://schemas.microsoft.com/office/word/2010/wordprocessingShape" mc:Ignorable="w14 w15 w16se w16cid w16 w16cex w16sdtdh w16sdtfl w16du wp14">
   <w:p>
     <w:pPr>
       <w:pStyle w:val="Normal0"/>
@@ -16657,7 +16686,7 @@
 </file>
 
 <file path=word/numbering.xml><?xml version="1.0" encoding="utf-8"?>
-<w:numbering xmlns:wpc="http://schemas.microsoft.com/office/word/2010/wordprocessingCanvas" xmlns:mc="http://schemas.openxmlformats.org/markup-compatibility/2006" xmlns:o="urn:schemas-microsoft-com:office:office" xmlns:r="http://schemas.openxmlformats.org/officeDocument/2006/relationships" xmlns:m="http://schemas.openxmlformats.org/officeDocument/2006/math" xmlns:v="urn:schemas-microsoft-com:vml" xmlns:wp14="http://schemas.microsoft.com/office/word/2010/wordprocessingDrawing" xmlns:wp="http://schemas.openxmlformats.org/drawingml/2006/wordprocessingDrawing" xmlns:w10="urn:schemas-microsoft-com:office:word" xmlns:w="http://schemas.openxmlformats.org/wordprocessingml/2006/main" xmlns:w14="http://schemas.microsoft.com/office/word/2010/wordml" xmlns:w15="http://schemas.microsoft.com/office/word/2012/wordml" xmlns:wpg="http://schemas.microsoft.com/office/word/2010/wordprocessingGroup" xmlns:wpi="http://schemas.microsoft.com/office/word/2010/wordprocessingInk" xmlns:wne="http://schemas.microsoft.com/office/word/2006/wordml" xmlns:wps="http://schemas.microsoft.com/office/word/2010/wordprocessingShape" mc:Ignorable="w14 w15 wp14">
+<w:numbering xmlns:wpc="http://schemas.microsoft.com/office/word/2010/wordprocessingCanvas" xmlns:cx="http://schemas.microsoft.com/office/drawing/2014/chartex" xmlns:cx1="http://schemas.microsoft.com/office/drawing/2015/9/8/chartex" xmlns:cx2="http://schemas.microsoft.com/office/drawing/2015/10/21/chartex" xmlns:cx3="http://schemas.microsoft.com/office/drawing/2016/5/9/chartex" xmlns:cx4="http://schemas.microsoft.com/office/drawing/2016/5/10/chartex" xmlns:cx5="http://schemas.microsoft.com/office/drawing/2016/5/11/chartex" xmlns:cx6="http://schemas.microsoft.com/office/drawing/2016/5/12/chartex" xmlns:cx7="http://schemas.microsoft.com/office/drawing/2016/5/13/chartex" xmlns:cx8="http://schemas.microsoft.com/office/drawing/2016/5/14/chartex" xmlns:mc="http://schemas.openxmlformats.org/markup-compatibility/2006" xmlns:aink="http://schemas.microsoft.com/office/drawing/2016/ink" xmlns:am3d="http://schemas.microsoft.com/office/drawing/2017/model3d" xmlns:o="urn:schemas-microsoft-com:office:office" xmlns:oel="http://schemas.microsoft.com/office/2019/extlst" xmlns:r="http://schemas.openxmlformats.org/officeDocument/2006/relationships" xmlns:m="http://schemas.openxmlformats.org/officeDocument/2006/math" xmlns:v="urn:schemas-microsoft-com:vml" xmlns:wp14="http://schemas.microsoft.com/office/word/2010/wordprocessingDrawing" xmlns:wp="http://schemas.openxmlformats.org/drawingml/2006/wordprocessingDrawing" xmlns:w10="urn:schemas-microsoft-com:office:word" xmlns:w="http://schemas.openxmlformats.org/wordprocessingml/2006/main" xmlns:w14="http://schemas.microsoft.com/office/word/2010/wordml" xmlns:w15="http://schemas.microsoft.com/office/word/2012/wordml" xmlns:w16cex="http://schemas.microsoft.com/office/word/2018/wordml/cex" xmlns:w16cid="http://schemas.microsoft.com/office/word/2016/wordml/cid" xmlns:w16="http://schemas.microsoft.com/office/word/2018/wordml" xmlns:w16du="http://schemas.microsoft.com/office/word/2023/wordml/word16du" xmlns:w16sdtdh="http://schemas.microsoft.com/office/word/2020/wordml/sdtdatahash" xmlns:w16sdtfl="http://schemas.microsoft.com/office/word/2024/wordml/sdtformatlock" xmlns:w16se="http://schemas.microsoft.com/office/word/2015/wordml/symex" xmlns:wpg="http://schemas.microsoft.com/office/word/2010/wordprocessingGroup" xmlns:wpi="http://schemas.microsoft.com/office/word/2010/wordprocessingInk" xmlns:wne="http://schemas.microsoft.com/office/word/2006/wordml" xmlns:wps="http://schemas.microsoft.com/office/word/2010/wordprocessingShape" mc:Ignorable="w14 w15 w16se w16cid w16 w16cex w16sdtdh w16sdtfl w16du wp14">
   <w:abstractNum w:abstractNumId="0" w15:restartNumberingAfterBreak="0">
     <w:nsid w:val="01606F96"/>
     <w:multiLevelType w:val="hybridMultilevel"/>
@@ -24162,208 +24191,208 @@
       </w:rPr>
     </w:lvl>
   </w:abstractNum>
-  <w:num w:numId="1">
+  <w:num w:numId="1" w16cid:durableId="470093790">
     <w:abstractNumId w:val="57"/>
   </w:num>
-  <w:num w:numId="2">
+  <w:num w:numId="2" w16cid:durableId="309604884">
     <w:abstractNumId w:val="16"/>
   </w:num>
-  <w:num w:numId="3">
+  <w:num w:numId="3" w16cid:durableId="1531870269">
     <w:abstractNumId w:val="67"/>
   </w:num>
-  <w:num w:numId="4">
+  <w:num w:numId="4" w16cid:durableId="1731417223">
     <w:abstractNumId w:val="45"/>
   </w:num>
-  <w:num w:numId="5">
+  <w:num w:numId="5" w16cid:durableId="1098335785">
     <w:abstractNumId w:val="58"/>
   </w:num>
-  <w:num w:numId="6">
+  <w:num w:numId="6" w16cid:durableId="1335643974">
     <w:abstractNumId w:val="24"/>
   </w:num>
-  <w:num w:numId="7">
+  <w:num w:numId="7" w16cid:durableId="1545216916">
     <w:abstractNumId w:val="42"/>
   </w:num>
-  <w:num w:numId="8">
+  <w:num w:numId="8" w16cid:durableId="959721560">
     <w:abstractNumId w:val="18"/>
   </w:num>
-  <w:num w:numId="9">
+  <w:num w:numId="9" w16cid:durableId="1190339823">
     <w:abstractNumId w:val="20"/>
   </w:num>
-  <w:num w:numId="10">
+  <w:num w:numId="10" w16cid:durableId="1863743767">
     <w:abstractNumId w:val="62"/>
   </w:num>
-  <w:num w:numId="11">
+  <w:num w:numId="11" w16cid:durableId="369888695">
     <w:abstractNumId w:val="6"/>
   </w:num>
-  <w:num w:numId="12">
+  <w:num w:numId="12" w16cid:durableId="855341590">
     <w:abstractNumId w:val="14"/>
   </w:num>
-  <w:num w:numId="13">
+  <w:num w:numId="13" w16cid:durableId="1890914348">
     <w:abstractNumId w:val="17"/>
   </w:num>
-  <w:num w:numId="14">
+  <w:num w:numId="14" w16cid:durableId="1968775901">
     <w:abstractNumId w:val="60"/>
   </w:num>
-  <w:num w:numId="15">
+  <w:num w:numId="15" w16cid:durableId="763503053">
     <w:abstractNumId w:val="26"/>
   </w:num>
-  <w:num w:numId="16">
+  <w:num w:numId="16" w16cid:durableId="4871347">
     <w:abstractNumId w:val="22"/>
   </w:num>
-  <w:num w:numId="17">
+  <w:num w:numId="17" w16cid:durableId="2125491931">
     <w:abstractNumId w:val="36"/>
   </w:num>
-  <w:num w:numId="18">
+  <w:num w:numId="18" w16cid:durableId="1218930983">
     <w:abstractNumId w:val="63"/>
   </w:num>
-  <w:num w:numId="19">
+  <w:num w:numId="19" w16cid:durableId="502939203">
     <w:abstractNumId w:val="1"/>
   </w:num>
-  <w:num w:numId="20">
+  <w:num w:numId="20" w16cid:durableId="2084448165">
     <w:abstractNumId w:val="37"/>
   </w:num>
-  <w:num w:numId="21">
+  <w:num w:numId="21" w16cid:durableId="1334409879">
     <w:abstractNumId w:val="56"/>
   </w:num>
-  <w:num w:numId="22">
+  <w:num w:numId="22" w16cid:durableId="122699898">
     <w:abstractNumId w:val="5"/>
   </w:num>
-  <w:num w:numId="23">
+  <w:num w:numId="23" w16cid:durableId="433935906">
     <w:abstractNumId w:val="3"/>
   </w:num>
-  <w:num w:numId="24">
+  <w:num w:numId="24" w16cid:durableId="126120240">
     <w:abstractNumId w:val="53"/>
   </w:num>
-  <w:num w:numId="25">
+  <w:num w:numId="25" w16cid:durableId="541478866">
     <w:abstractNumId w:val="31"/>
   </w:num>
-  <w:num w:numId="26">
+  <w:num w:numId="26" w16cid:durableId="2040203800">
     <w:abstractNumId w:val="32"/>
   </w:num>
-  <w:num w:numId="27">
+  <w:num w:numId="27" w16cid:durableId="1778863183">
     <w:abstractNumId w:val="8"/>
   </w:num>
-  <w:num w:numId="28">
+  <w:num w:numId="28" w16cid:durableId="1486430978">
     <w:abstractNumId w:val="27"/>
   </w:num>
-  <w:num w:numId="29">
+  <w:num w:numId="29" w16cid:durableId="1980719481">
     <w:abstractNumId w:val="39"/>
   </w:num>
-  <w:num w:numId="30">
+  <w:num w:numId="30" w16cid:durableId="1539507120">
     <w:abstractNumId w:val="66"/>
   </w:num>
-  <w:num w:numId="31">
+  <w:num w:numId="31" w16cid:durableId="1283147248">
     <w:abstractNumId w:val="23"/>
   </w:num>
-  <w:num w:numId="32">
+  <w:num w:numId="32" w16cid:durableId="643851913">
     <w:abstractNumId w:val="50"/>
   </w:num>
-  <w:num w:numId="33">
+  <w:num w:numId="33" w16cid:durableId="133106902">
     <w:abstractNumId w:val="4"/>
   </w:num>
-  <w:num w:numId="34">
+  <w:num w:numId="34" w16cid:durableId="170683937">
     <w:abstractNumId w:val="25"/>
   </w:num>
-  <w:num w:numId="35">
+  <w:num w:numId="35" w16cid:durableId="941378487">
     <w:abstractNumId w:val="28"/>
   </w:num>
-  <w:num w:numId="36">
+  <w:num w:numId="36" w16cid:durableId="482507543">
     <w:abstractNumId w:val="54"/>
   </w:num>
-  <w:num w:numId="37">
+  <w:num w:numId="37" w16cid:durableId="986056016">
     <w:abstractNumId w:val="0"/>
   </w:num>
-  <w:num w:numId="38">
+  <w:num w:numId="38" w16cid:durableId="630984558">
     <w:abstractNumId w:val="7"/>
   </w:num>
-  <w:num w:numId="39">
+  <w:num w:numId="39" w16cid:durableId="1828398182">
     <w:abstractNumId w:val="55"/>
   </w:num>
-  <w:num w:numId="40">
+  <w:num w:numId="40" w16cid:durableId="1701121749">
     <w:abstractNumId w:val="47"/>
   </w:num>
-  <w:num w:numId="41">
+  <w:num w:numId="41" w16cid:durableId="439418946">
     <w:abstractNumId w:val="21"/>
   </w:num>
-  <w:num w:numId="42">
+  <w:num w:numId="42" w16cid:durableId="1566990743">
     <w:abstractNumId w:val="49"/>
   </w:num>
-  <w:num w:numId="43">
+  <w:num w:numId="43" w16cid:durableId="263001702">
     <w:abstractNumId w:val="34"/>
   </w:num>
-  <w:num w:numId="44">
+  <w:num w:numId="44" w16cid:durableId="471753789">
     <w:abstractNumId w:val="19"/>
   </w:num>
-  <w:num w:numId="45">
+  <w:num w:numId="45" w16cid:durableId="1514297199">
     <w:abstractNumId w:val="61"/>
   </w:num>
-  <w:num w:numId="46">
+  <w:num w:numId="46" w16cid:durableId="420028001">
     <w:abstractNumId w:val="10"/>
   </w:num>
-  <w:num w:numId="47">
+  <w:num w:numId="47" w16cid:durableId="1655450516">
     <w:abstractNumId w:val="44"/>
   </w:num>
-  <w:num w:numId="48">
+  <w:num w:numId="48" w16cid:durableId="1239091931">
     <w:abstractNumId w:val="52"/>
   </w:num>
-  <w:num w:numId="49">
+  <w:num w:numId="49" w16cid:durableId="1137605801">
     <w:abstractNumId w:val="9"/>
   </w:num>
-  <w:num w:numId="50">
+  <w:num w:numId="50" w16cid:durableId="2014717350">
     <w:abstractNumId w:val="48"/>
   </w:num>
-  <w:num w:numId="51">
+  <w:num w:numId="51" w16cid:durableId="831455699">
     <w:abstractNumId w:val="64"/>
   </w:num>
-  <w:num w:numId="52">
+  <w:num w:numId="52" w16cid:durableId="512765888">
     <w:abstractNumId w:val="51"/>
   </w:num>
-  <w:num w:numId="53">
+  <w:num w:numId="53" w16cid:durableId="1759057865">
     <w:abstractNumId w:val="11"/>
   </w:num>
-  <w:num w:numId="54">
+  <w:num w:numId="54" w16cid:durableId="2083213409">
     <w:abstractNumId w:val="12"/>
   </w:num>
-  <w:num w:numId="55">
+  <w:num w:numId="55" w16cid:durableId="1998455719">
     <w:abstractNumId w:val="43"/>
   </w:num>
-  <w:num w:numId="56">
+  <w:num w:numId="56" w16cid:durableId="1866939886">
     <w:abstractNumId w:val="15"/>
   </w:num>
-  <w:num w:numId="57">
+  <w:num w:numId="57" w16cid:durableId="1206674294">
     <w:abstractNumId w:val="41"/>
   </w:num>
-  <w:num w:numId="58">
+  <w:num w:numId="58" w16cid:durableId="1781294100">
     <w:abstractNumId w:val="30"/>
   </w:num>
-  <w:num w:numId="59">
+  <w:num w:numId="59" w16cid:durableId="1516812">
     <w:abstractNumId w:val="59"/>
   </w:num>
-  <w:num w:numId="60">
+  <w:num w:numId="60" w16cid:durableId="71044912">
     <w:abstractNumId w:val="46"/>
   </w:num>
-  <w:num w:numId="61">
+  <w:num w:numId="61" w16cid:durableId="530068420">
     <w:abstractNumId w:val="65"/>
   </w:num>
-  <w:num w:numId="62">
+  <w:num w:numId="62" w16cid:durableId="14579609">
     <w:abstractNumId w:val="35"/>
   </w:num>
-  <w:num w:numId="63">
+  <w:num w:numId="63" w16cid:durableId="598027650">
     <w:abstractNumId w:val="29"/>
   </w:num>
-  <w:num w:numId="64">
+  <w:num w:numId="64" w16cid:durableId="1238788878">
     <w:abstractNumId w:val="33"/>
   </w:num>
-  <w:num w:numId="65">
+  <w:num w:numId="65" w16cid:durableId="987589088">
     <w:abstractNumId w:val="2"/>
   </w:num>
-  <w:num w:numId="66">
+  <w:num w:numId="66" w16cid:durableId="172770217">
     <w:abstractNumId w:val="13"/>
   </w:num>
-  <w:num w:numId="67">
+  <w:num w:numId="67" w16cid:durableId="23021600">
     <w:abstractNumId w:val="40"/>
   </w:num>
-  <w:num w:numId="68">
+  <w:num w:numId="68" w16cid:durableId="1584682042">
     <w:abstractNumId w:val="38"/>
   </w:num>
   <w:numIdMacAtCleanup w:val="68"/>
@@ -24371,7 +24400,7 @@
 </file>
 
 <file path=word/people.xml><?xml version="1.0" encoding="utf-8"?>
-<w15:people xmlns:wpc="http://schemas.microsoft.com/office/word/2010/wordprocessingCanvas" xmlns:mc="http://schemas.openxmlformats.org/markup-compatibility/2006" xmlns:o="urn:schemas-microsoft-com:office:office" xmlns:r="http://schemas.openxmlformats.org/officeDocument/2006/relationships" xmlns:m="http://schemas.openxmlformats.org/officeDocument/2006/math" xmlns:v="urn:schemas-microsoft-com:vml" xmlns:wp14="http://schemas.microsoft.com/office/word/2010/wordprocessingDrawing" xmlns:wp="http://schemas.openxmlformats.org/drawingml/2006/wordprocessingDrawing" xmlns:w10="urn:schemas-microsoft-com:office:word" xmlns:w="http://schemas.openxmlformats.org/wordprocessingml/2006/main" xmlns:w14="http://schemas.microsoft.com/office/word/2010/wordml" xmlns:w15="http://schemas.microsoft.com/office/word/2012/wordml" xmlns:wpg="http://schemas.microsoft.com/office/word/2010/wordprocessingGroup" xmlns:wpi="http://schemas.microsoft.com/office/word/2010/wordprocessingInk" xmlns:wne="http://schemas.microsoft.com/office/word/2006/wordml" xmlns:wps="http://schemas.microsoft.com/office/word/2010/wordprocessingShape" mc:Ignorable="w14 w15 wp14">
+<w15:people xmlns:wpc="http://schemas.microsoft.com/office/word/2010/wordprocessingCanvas" xmlns:cx="http://schemas.microsoft.com/office/drawing/2014/chartex" xmlns:cx1="http://schemas.microsoft.com/office/drawing/2015/9/8/chartex" xmlns:cx2="http://schemas.microsoft.com/office/drawing/2015/10/21/chartex" xmlns:cx3="http://schemas.microsoft.com/office/drawing/2016/5/9/chartex" xmlns:cx4="http://schemas.microsoft.com/office/drawing/2016/5/10/chartex" xmlns:cx5="http://schemas.microsoft.com/office/drawing/2016/5/11/chartex" xmlns:cx6="http://schemas.microsoft.com/office/drawing/2016/5/12/chartex" xmlns:cx7="http://schemas.microsoft.com/office/drawing/2016/5/13/chartex" xmlns:cx8="http://schemas.microsoft.com/office/drawing/2016/5/14/chartex" xmlns:mc="http://schemas.openxmlformats.org/markup-compatibility/2006" xmlns:aink="http://schemas.microsoft.com/office/drawing/2016/ink" xmlns:am3d="http://schemas.microsoft.com/office/drawing/2017/model3d" xmlns:o="urn:schemas-microsoft-com:office:office" xmlns:oel="http://schemas.microsoft.com/office/2019/extlst" xmlns:r="http://schemas.openxmlformats.org/officeDocument/2006/relationships" xmlns:m="http://schemas.openxmlformats.org/officeDocument/2006/math" xmlns:v="urn:schemas-microsoft-com:vml" xmlns:wp14="http://schemas.microsoft.com/office/word/2010/wordprocessingDrawing" xmlns:wp="http://schemas.openxmlformats.org/drawingml/2006/wordprocessingDrawing" xmlns:w10="urn:schemas-microsoft-com:office:word" xmlns:w="http://schemas.openxmlformats.org/wordprocessingml/2006/main" xmlns:w14="http://schemas.microsoft.com/office/word/2010/wordml" xmlns:w15="http://schemas.microsoft.com/office/word/2012/wordml" xmlns:w16cex="http://schemas.microsoft.com/office/word/2018/wordml/cex" xmlns:w16cid="http://schemas.microsoft.com/office/word/2016/wordml/cid" xmlns:w16="http://schemas.microsoft.com/office/word/2018/wordml" xmlns:w16du="http://schemas.microsoft.com/office/word/2023/wordml/word16du" xmlns:w16sdtdh="http://schemas.microsoft.com/office/word/2020/wordml/sdtdatahash" xmlns:w16sdtfl="http://schemas.microsoft.com/office/word/2024/wordml/sdtformatlock" xmlns:w16se="http://schemas.microsoft.com/office/word/2015/wordml/symex" xmlns:wpg="http://schemas.microsoft.com/office/word/2010/wordprocessingGroup" xmlns:wpi="http://schemas.microsoft.com/office/word/2010/wordprocessingInk" xmlns:wne="http://schemas.microsoft.com/office/word/2006/wordml" xmlns:wps="http://schemas.microsoft.com/office/word/2010/wordprocessingShape" mc:Ignorable="w14 w15 w16se w16cid w16 w16cex w16sdtdh w16sdtfl w16du wp14">
   <w15:person w15:author="LauraPGM">
     <w15:presenceInfo w15:providerId="None" w15:userId="LauraPGM"/>
   </w15:person>
@@ -24379,7 +24408,7 @@
 </file>
 
 <file path=word/styles.xml><?xml version="1.0" encoding="utf-8"?>
-<w:styles xmlns:mc="http://schemas.openxmlformats.org/markup-compatibility/2006" xmlns:r="http://schemas.openxmlformats.org/officeDocument/2006/relationships" xmlns:w="http://schemas.openxmlformats.org/wordprocessingml/2006/main" xmlns:w14="http://schemas.microsoft.com/office/word/2010/wordml" xmlns:w15="http://schemas.microsoft.com/office/word/2012/wordml" mc:Ignorable="w14 w15">
+<w:styles xmlns:mc="http://schemas.openxmlformats.org/markup-compatibility/2006" xmlns:r="http://schemas.openxmlformats.org/officeDocument/2006/relationships" xmlns:w="http://schemas.openxmlformats.org/wordprocessingml/2006/main" xmlns:w14="http://schemas.microsoft.com/office/word/2010/wordml" xmlns:w15="http://schemas.microsoft.com/office/word/2012/wordml" xmlns:w16cex="http://schemas.microsoft.com/office/word/2018/wordml/cex" xmlns:w16cid="http://schemas.microsoft.com/office/word/2016/wordml/cid" xmlns:w16="http://schemas.microsoft.com/office/word/2018/wordml" xmlns:w16du="http://schemas.microsoft.com/office/word/2023/wordml/word16du" xmlns:w16sdtdh="http://schemas.microsoft.com/office/word/2020/wordml/sdtdatahash" xmlns:w16sdtfl="http://schemas.microsoft.com/office/word/2024/wordml/sdtformatlock" xmlns:w16se="http://schemas.microsoft.com/office/word/2015/wordml/symex" mc:Ignorable="w14 w15 w16se w16cid w16 w16cex w16sdtdh w16sdtfl w16du">
   <w:docDefaults>
     <w:rPrDefault>
       <w:rPr>
@@ -24395,7 +24424,7 @@
       </w:pPr>
     </w:pPrDefault>
   </w:docDefaults>
-  <w:latentStyles w:defLockedState="0" w:defUIPriority="99" w:defSemiHidden="0" w:defUnhideWhenUsed="0" w:defQFormat="0" w:count="371">
+  <w:latentStyles w:defLockedState="0" w:defUIPriority="99" w:defSemiHidden="0" w:defUnhideWhenUsed="0" w:defQFormat="0" w:count="376">
     <w:lsdException w:name="Normal" w:uiPriority="0" w:qFormat="1"/>
     <w:lsdException w:name="heading 1" w:uiPriority="9" w:qFormat="1"/>
     <w:lsdException w:name="heading 2" w:semiHidden="1" w:uiPriority="9" w:unhideWhenUsed="1" w:qFormat="1"/>
@@ -24767,6 +24796,11 @@
     <w:lsdException w:name="List Table 5 Dark Accent 6" w:uiPriority="50"/>
     <w:lsdException w:name="List Table 6 Colorful Accent 6" w:uiPriority="51"/>
     <w:lsdException w:name="List Table 7 Colorful Accent 6" w:uiPriority="52"/>
+    <w:lsdException w:name="Mention" w:semiHidden="1" w:unhideWhenUsed="1"/>
+    <w:lsdException w:name="Smart Hyperlink" w:semiHidden="1" w:unhideWhenUsed="1"/>
+    <w:lsdException w:name="Hashtag" w:semiHidden="1" w:unhideWhenUsed="1"/>
+    <w:lsdException w:name="Unresolved Mention" w:semiHidden="1" w:unhideWhenUsed="1"/>
+    <w:lsdException w:name="Smart Link" w:semiHidden="1" w:unhideWhenUsed="1"/>
   </w:latentStyles>
   <w:style w:type="paragraph" w:default="1" w:styleId="Normal">
     <w:name w:val="Normal"/>
@@ -24912,7 +24946,7 @@
     <w:semiHidden/>
     <w:unhideWhenUsed/>
   </w:style>
-  <w:style w:type="paragraph" w:styleId="Puesto">
+  <w:style w:type="paragraph" w:styleId="Ttulo">
     <w:name w:val="Title"/>
     <w:basedOn w:val="Normal"/>
     <w:next w:val="Normal"/>
@@ -26182,8 +26216,8 @@
       <w:lang w:val="es-ES" w:eastAsia="en-US"/>
     </w:rPr>
   </w:style>
-  <w:style w:type="character" w:customStyle="1" w:styleId="UnresolvedMention">
-    <w:name w:val="Unresolved Mention"/>
+  <w:style w:type="character" w:customStyle="1" w:styleId="Mencinsinresolver3">
+    <w:name w:val="Mención sin resolver3"/>
     <w:basedOn w:val="Fuentedeprrafopredeter"/>
     <w:uiPriority w:val="99"/>
     <w:semiHidden/>
@@ -26559,23 +26593,6 @@
 </file>
 
 <file path=customXml/item2.xml><?xml version="1.0" encoding="utf-8"?>
-<go:gDocsCustomXmlDataStorage xmlns:go="http://customooxmlschemas.google.com/" xmlns:r="http://schemas.openxmlformats.org/officeDocument/2006/relationships">
-  <go:docsCustomData xmlns:go="http://customooxmlschemas.google.com/" roundtripDataSignature="AMtx7mh3w1sXrKwdjzYCxjbwPkf7wsIk5w==">AMUW2mWhRc/xLonLdtoI8dz4BVu2GREgE7++Eme5Ko+W5/2G+QfXPKxV7NwLPPaJ77IM2LrlHDguxVZnDKcg4iQIvJIe+zJ9DBWjUaWFI+z0k4HbdiCFsJo=</go:docsCustomData>
-</go:gDocsCustomXmlDataStorage>
-</file>
-
-<file path=customXml/item3.xml><?xml version="1.0" encoding="utf-8"?>
-<p:properties xmlns:p="http://schemas.microsoft.com/office/2006/metadata/properties" xmlns:xsi="http://www.w3.org/2001/XMLSchema-instance" xmlns:pc="http://schemas.microsoft.com/office/infopath/2007/PartnerControls">
-  <documentManagement>
-    <TaxCatchAll xmlns="cb45339b-ced9-4d0d-8f64-77573914d53b" xsi:nil="true"/>
-    <lcf76f155ced4ddcb4097134ff3c332f xmlns="43a3ca16-9c26-4813-b83f-4aec9927b43f">
-      <Terms xmlns="http://schemas.microsoft.com/office/infopath/2007/PartnerControls"/>
-    </lcf76f155ced4ddcb4097134ff3c332f>
-  </documentManagement>
-</p:properties>
-</file>
-
-<file path=customXml/item4.xml><?xml version="1.0" encoding="utf-8"?>
 <ct:contentTypeSchema xmlns:ct="http://schemas.microsoft.com/office/2006/metadata/contentType" xmlns:ma="http://schemas.microsoft.com/office/2006/metadata/properties/metaAttributes" ct:_="" ma:_="" ma:contentTypeName="Documento" ma:contentTypeID="0x01010049282E1EDBE9234EA9E6D38F720E265F" ma:contentTypeVersion="15" ma:contentTypeDescription="Crear nuevo documento." ma:contentTypeScope="" ma:versionID="b31c7aa9eaf043a08b87120b3c4916e3">
   <xsd:schema xmlns:xsd="http://www.w3.org/2001/XMLSchema" xmlns:xs="http://www.w3.org/2001/XMLSchema" xmlns:p="http://schemas.microsoft.com/office/2006/metadata/properties" xmlns:ns2="cb45339b-ced9-4d0d-8f64-77573914d53b" xmlns:ns3="43a3ca16-9c26-4813-b83f-4aec9927b43f" targetNamespace="http://schemas.microsoft.com/office/2006/metadata/properties" ma:root="true" ma:fieldsID="3533d065b04d75c457075bc55f1f5315" ns2:_="" ns3:_="">
     <xsd:import namespace="cb45339b-ced9-4d0d-8f64-77573914d53b"/>
@@ -26810,6 +26827,23 @@
 </ct:contentTypeSchema>
 </file>
 
+<file path=customXml/item3.xml><?xml version="1.0" encoding="utf-8"?>
+<p:properties xmlns:p="http://schemas.microsoft.com/office/2006/metadata/properties" xmlns:xsi="http://www.w3.org/2001/XMLSchema-instance" xmlns:pc="http://schemas.microsoft.com/office/infopath/2007/PartnerControls">
+  <documentManagement>
+    <TaxCatchAll xmlns="cb45339b-ced9-4d0d-8f64-77573914d53b" xsi:nil="true"/>
+    <lcf76f155ced4ddcb4097134ff3c332f xmlns="43a3ca16-9c26-4813-b83f-4aec9927b43f">
+      <Terms xmlns="http://schemas.microsoft.com/office/infopath/2007/PartnerControls"/>
+    </lcf76f155ced4ddcb4097134ff3c332f>
+  </documentManagement>
+</p:properties>
+</file>
+
+<file path=customXml/item4.xml><?xml version="1.0" encoding="utf-8"?>
+<go:gDocsCustomXmlDataStorage xmlns:go="http://customooxmlschemas.google.com/" xmlns:r="http://schemas.openxmlformats.org/officeDocument/2006/relationships">
+  <go:docsCustomData xmlns:go="http://customooxmlschemas.google.com/" roundtripDataSignature="AMtx7mh3w1sXrKwdjzYCxjbwPkf7wsIk5w==">AMUW2mWhRc/xLonLdtoI8dz4BVu2GREgE7++Eme5Ko+W5/2G+QfXPKxV7NwLPPaJ77IM2LrlHDguxVZnDKcg4iQIvJIe+zJ9DBWjUaWFI+z0k4HbdiCFsJo=</go:docsCustomData>
+</go:gDocsCustomXmlDataStorage>
+</file>
+
 <file path=customXml/itemProps1.xml><?xml version="1.0" encoding="utf-8"?>
 <ds:datastoreItem xmlns:ds="http://schemas.openxmlformats.org/officeDocument/2006/customXml" ds:itemID="{83102ECF-E44F-4F73-A78F-FE313D1BFB9A}">
   <ds:schemaRefs>
@@ -26819,10 +26853,20 @@
 </file>
 
 <file path=customXml/itemProps2.xml><?xml version="1.0" encoding="utf-8"?>
-<ds:datastoreItem xmlns:ds="http://schemas.openxmlformats.org/officeDocument/2006/customXml" ds:itemID="{11111111-1234-1234-1234-123412341234}">
+<ds:datastoreItem xmlns:ds="http://schemas.openxmlformats.org/officeDocument/2006/customXml" ds:itemID="{3D1068F1-66D2-41CC-ADBA-729CD21E93E6}">
   <ds:schemaRefs>
-    <ds:schemaRef ds:uri="http://customooxmlschemas.google.com/"/>
-    <ds:schemaRef ds:uri="http://schemas.openxmlformats.org/officeDocument/2006/relationships"/>
+    <ds:schemaRef ds:uri="http://schemas.microsoft.com/office/2006/metadata/contentType"/>
+    <ds:schemaRef ds:uri="http://schemas.microsoft.com/office/2006/metadata/properties/metaAttributes"/>
+    <ds:schemaRef ds:uri="http://www.w3.org/2001/XMLSchema"/>
+    <ds:schemaRef ds:uri="http://schemas.microsoft.com/office/2006/metadata/properties"/>
+    <ds:schemaRef ds:uri="cb45339b-ced9-4d0d-8f64-77573914d53b"/>
+    <ds:schemaRef ds:uri="43a3ca16-9c26-4813-b83f-4aec9927b43f"/>
+    <ds:schemaRef ds:uri="http://schemas.microsoft.com/office/2006/documentManagement/types"/>
+    <ds:schemaRef ds:uri="http://schemas.microsoft.com/office/infopath/2007/PartnerControls"/>
+    <ds:schemaRef ds:uri="http://schemas.openxmlformats.org/package/2006/metadata/core-properties"/>
+    <ds:schemaRef ds:uri="http://purl.org/dc/elements/1.1/"/>
+    <ds:schemaRef ds:uri="http://purl.org/dc/terms/"/>
+    <ds:schemaRef ds:uri="http://schemas.microsoft.com/internal/obd"/>
   </ds:schemaRefs>
 </ds:datastoreItem>
 </file>
@@ -26832,12 +26876,17 @@
   <ds:schemaRefs>
     <ds:schemaRef ds:uri="http://schemas.microsoft.com/office/2006/metadata/properties"/>
     <ds:schemaRef ds:uri="http://schemas.microsoft.com/office/infopath/2007/PartnerControls"/>
-    <ds:schemaRef ds:uri="1d52d4bc-3f95-4709-b359-1b96840d7671"/>
-    <ds:schemaRef ds:uri="8d1bea48-6525-4b05-8cf5-c6ad0dd5b02f"/>
+    <ds:schemaRef ds:uri="cb45339b-ced9-4d0d-8f64-77573914d53b"/>
+    <ds:schemaRef ds:uri="43a3ca16-9c26-4813-b83f-4aec9927b43f"/>
   </ds:schemaRefs>
 </ds:datastoreItem>
 </file>
 
 <file path=customXml/itemProps4.xml><?xml version="1.0" encoding="utf-8"?>
-<ds:datastoreItem xmlns:ds="http://schemas.openxmlformats.org/officeDocument/2006/customXml" ds:itemID="{3D1068F1-66D2-41CC-ADBA-729CD21E93E6}"/>
+<ds:datastoreItem xmlns:ds="http://schemas.openxmlformats.org/officeDocument/2006/customXml" ds:itemID="{11111111-1234-1234-1234-123412341234}">
+  <ds:schemaRefs>
+    <ds:schemaRef ds:uri="http://customooxmlschemas.google.com/"/>
+    <ds:schemaRef ds:uri="http://schemas.openxmlformats.org/officeDocument/2006/relationships"/>
+  </ds:schemaRefs>
+</ds:datastoreItem>
 </file>
</xml_diff>